<commit_message>
Changed QR code on resume
</commit_message>
<xml_diff>
--- a/assets/Seth Frame Resume.docx
+++ b/assets/Seth Frame Resume.docx
@@ -12,6 +12,7 @@
           <w:szCs w:val="32"/>
         </w:rPr>
       </w:pPr>
+      <w:bookmarkStart w:id="0" w:name="_GoBack"/>
       <w:r>
         <w:rPr>
           <w:rFonts w:ascii="Times New Roman" w:hAnsi="Times New Roman"/>
@@ -21,7 +22,7 @@
           <w:szCs w:val="32"/>
         </w:rPr>
         <w:drawing>
-          <wp:anchor distT="0" distB="0" distL="114300" distR="114300" simplePos="0" relativeHeight="251658240" behindDoc="0" locked="0" layoutInCell="1" allowOverlap="1" wp14:anchorId="0781D34D" wp14:editId="1A93EAF8">
+          <wp:anchor distT="0" distB="0" distL="114300" distR="114300" simplePos="0" relativeHeight="251658240" behindDoc="0" locked="0" layoutInCell="1" allowOverlap="1" wp14:anchorId="0781D34D" wp14:editId="35079DD4">
             <wp:simplePos x="0" y="0"/>
             <wp:positionH relativeFrom="margin">
               <wp:posOffset>-95250</wp:posOffset>
@@ -76,6 +77,7 @@
           </wp:anchor>
         </w:drawing>
       </w:r>
+      <w:bookmarkEnd w:id="0"/>
       <w:r>
         <w:rPr>
           <w:rFonts w:ascii="Times New Roman" w:hAnsi="Times New Roman"/>
@@ -2129,8 +2131,6 @@
           <w:rFonts w:ascii="Times New Roman" w:hAnsi="Times New Roman"/>
         </w:rPr>
       </w:pPr>
-      <w:bookmarkStart w:id="0" w:name="_GoBack"/>
-      <w:bookmarkEnd w:id="0"/>
     </w:p>
     <w:p>
       <w:pPr>
@@ -5134,7 +5134,7 @@
 </file>
 
 <file path=customXml/itemProps1.xml><?xml version="1.0" encoding="utf-8"?>
-<ds:datastoreItem xmlns:ds="http://schemas.openxmlformats.org/officeDocument/2006/customXml" ds:itemID="{7DC269BD-E5AE-42DD-AE16-7AB72D26F884}">
+<ds:datastoreItem xmlns:ds="http://schemas.openxmlformats.org/officeDocument/2006/customXml" ds:itemID="{4F69F0A7-2983-496E-9297-5D7821E6D020}">
   <ds:schemaRefs>
     <ds:schemaRef ds:uri="http://schemas.openxmlformats.org/officeDocument/2006/bibliography"/>
   </ds:schemaRefs>

</xml_diff>